<commit_message>
Les exigences pour chaque sous-groupe
</commit_message>
<xml_diff>
--- a/groupe1-bd/Répartition des tâches.docx
+++ b/groupe1-bd/Répartition des tâches.docx
@@ -27,15 +27,15 @@
       <w:pPr>
         <w:rPr>
           <w:rFonts w:ascii="Bell MT" w:hAnsi="Bell MT"/>
-          <w:sz w:val="32"/>
-          <w:szCs w:val="32"/>
-        </w:rPr>
-      </w:pPr>
-      <w:r>
-        <w:rPr>
-          <w:rFonts w:ascii="Bell MT" w:hAnsi="Bell MT"/>
-          <w:sz w:val="32"/>
-          <w:szCs w:val="32"/>
+          <w:sz w:val="24"/>
+          <w:szCs w:val="24"/>
+        </w:rPr>
+      </w:pPr>
+      <w:r>
+        <w:rPr>
+          <w:rFonts w:ascii="Bell MT" w:hAnsi="Bell MT"/>
+          <w:sz w:val="24"/>
+          <w:szCs w:val="24"/>
         </w:rPr>
         <w:t xml:space="preserve">Equipe BD : </w:t>
       </w:r>
@@ -43,8 +43,8 @@
       <w:r>
         <w:rPr>
           <w:rFonts w:ascii="Bell MT" w:hAnsi="Bell MT"/>
-          <w:sz w:val="32"/>
-          <w:szCs w:val="32"/>
+          <w:sz w:val="24"/>
+          <w:szCs w:val="24"/>
         </w:rPr>
         <w:t>Déo</w:t>
       </w:r>
@@ -52,8 +52,8 @@
       <w:r>
         <w:rPr>
           <w:rFonts w:ascii="Bell MT" w:hAnsi="Bell MT"/>
-          <w:sz w:val="32"/>
-          <w:szCs w:val="32"/>
+          <w:sz w:val="24"/>
+          <w:szCs w:val="24"/>
         </w:rPr>
         <w:t>-Gracias, Jefferson, Isaac.</w:t>
       </w:r>
@@ -62,39 +62,39 @@
       <w:pPr>
         <w:rPr>
           <w:rFonts w:ascii="Bell MT" w:hAnsi="Bell MT"/>
-          <w:sz w:val="32"/>
-          <w:szCs w:val="32"/>
-        </w:rPr>
-      </w:pPr>
-      <w:r>
-        <w:rPr>
-          <w:rFonts w:ascii="Bell MT" w:hAnsi="Bell MT"/>
-          <w:sz w:val="32"/>
-          <w:szCs w:val="32"/>
+          <w:sz w:val="24"/>
+          <w:szCs w:val="24"/>
+        </w:rPr>
+      </w:pPr>
+      <w:r>
+        <w:rPr>
+          <w:rFonts w:ascii="Bell MT" w:hAnsi="Bell MT"/>
+          <w:sz w:val="24"/>
+          <w:szCs w:val="24"/>
         </w:rPr>
         <w:t>Equipe AA</w:t>
       </w:r>
       <w:r>
         <w:rPr>
           <w:rFonts w:ascii="Bell MT" w:hAnsi="Bell MT"/>
-          <w:sz w:val="32"/>
-          <w:szCs w:val="32"/>
+          <w:sz w:val="24"/>
+          <w:szCs w:val="24"/>
         </w:rPr>
         <w:t xml:space="preserve"> (Application d’automatisation)</w:t>
       </w:r>
       <w:r>
         <w:rPr>
           <w:rFonts w:ascii="Bell MT" w:hAnsi="Bell MT"/>
-          <w:sz w:val="32"/>
-          <w:szCs w:val="32"/>
+          <w:sz w:val="24"/>
+          <w:szCs w:val="24"/>
         </w:rPr>
         <w:t xml:space="preserve"> : </w:t>
       </w:r>
       <w:r>
         <w:rPr>
           <w:rFonts w:ascii="Bell MT" w:hAnsi="Bell MT"/>
-          <w:sz w:val="32"/>
-          <w:szCs w:val="32"/>
+          <w:sz w:val="24"/>
+          <w:szCs w:val="24"/>
         </w:rPr>
         <w:t xml:space="preserve">Stephen et </w:t>
       </w:r>
@@ -102,8 +102,8 @@
       <w:r>
         <w:rPr>
           <w:rFonts w:ascii="Bell MT" w:hAnsi="Bell MT"/>
-          <w:sz w:val="32"/>
-          <w:szCs w:val="32"/>
+          <w:sz w:val="24"/>
+          <w:szCs w:val="24"/>
         </w:rPr>
         <w:t>Kadir</w:t>
       </w:r>
@@ -111,8 +111,8 @@
       <w:r>
         <w:rPr>
           <w:rFonts w:ascii="Bell MT" w:hAnsi="Bell MT"/>
-          <w:sz w:val="32"/>
-          <w:szCs w:val="32"/>
+          <w:sz w:val="24"/>
+          <w:szCs w:val="24"/>
         </w:rPr>
         <w:t>.</w:t>
       </w:r>
@@ -121,39 +121,39 @@
       <w:pPr>
         <w:rPr>
           <w:rFonts w:ascii="Bell MT" w:hAnsi="Bell MT"/>
-          <w:sz w:val="32"/>
-          <w:szCs w:val="32"/>
-        </w:rPr>
-      </w:pPr>
-      <w:r>
-        <w:rPr>
-          <w:rFonts w:ascii="Bell MT" w:hAnsi="Bell MT"/>
-          <w:sz w:val="32"/>
-          <w:szCs w:val="32"/>
+          <w:sz w:val="24"/>
+          <w:szCs w:val="24"/>
+        </w:rPr>
+      </w:pPr>
+      <w:r>
+        <w:rPr>
+          <w:rFonts w:ascii="Bell MT" w:hAnsi="Bell MT"/>
+          <w:sz w:val="24"/>
+          <w:szCs w:val="24"/>
         </w:rPr>
         <w:t>Equipe AE </w:t>
       </w:r>
       <w:r>
         <w:rPr>
           <w:rFonts w:ascii="Bell MT" w:hAnsi="Bell MT"/>
-          <w:sz w:val="32"/>
-          <w:szCs w:val="32"/>
+          <w:sz w:val="24"/>
+          <w:szCs w:val="24"/>
         </w:rPr>
         <w:t>(Application d’exploitation)</w:t>
       </w:r>
       <w:r>
         <w:rPr>
           <w:rFonts w:ascii="Bell MT" w:hAnsi="Bell MT"/>
-          <w:sz w:val="32"/>
-          <w:szCs w:val="32"/>
+          <w:sz w:val="24"/>
+          <w:szCs w:val="24"/>
         </w:rPr>
         <w:t xml:space="preserve">: </w:t>
       </w:r>
       <w:r>
         <w:rPr>
           <w:rFonts w:ascii="Bell MT" w:hAnsi="Bell MT"/>
-          <w:sz w:val="32"/>
-          <w:szCs w:val="32"/>
+          <w:sz w:val="24"/>
+          <w:szCs w:val="24"/>
         </w:rPr>
         <w:t xml:space="preserve">Enock, Yasmine, </w:t>
       </w:r>
@@ -161,8 +161,8 @@
       <w:r>
         <w:rPr>
           <w:rFonts w:ascii="Bell MT" w:hAnsi="Bell MT"/>
-          <w:sz w:val="32"/>
-          <w:szCs w:val="32"/>
+          <w:sz w:val="24"/>
+          <w:szCs w:val="24"/>
         </w:rPr>
         <w:t>Bénicia</w:t>
       </w:r>
@@ -170,8 +170,8 @@
       <w:r>
         <w:rPr>
           <w:rFonts w:ascii="Bell MT" w:hAnsi="Bell MT"/>
-          <w:sz w:val="32"/>
-          <w:szCs w:val="32"/>
+          <w:sz w:val="24"/>
+          <w:szCs w:val="24"/>
         </w:rPr>
         <w:t>.</w:t>
       </w:r>
@@ -180,103 +180,847 @@
       <w:pPr>
         <w:rPr>
           <w:rFonts w:ascii="Bell MT" w:hAnsi="Bell MT"/>
-          <w:sz w:val="32"/>
-          <w:szCs w:val="32"/>
-        </w:rPr>
-      </w:pPr>
-    </w:p>
-    <w:p>
-      <w:pPr>
-        <w:rPr>
-          <w:rFonts w:ascii="Bell MT" w:hAnsi="Bell MT"/>
-          <w:sz w:val="32"/>
-          <w:szCs w:val="32"/>
-        </w:rPr>
-      </w:pPr>
+          <w:sz w:val="24"/>
+          <w:szCs w:val="24"/>
+        </w:rPr>
+      </w:pPr>
+    </w:p>
+    <w:p>
+      <w:pPr>
+        <w:rPr>
+          <w:rFonts w:ascii="Bell MT" w:hAnsi="Bell MT"/>
+          <w:sz w:val="24"/>
+          <w:szCs w:val="24"/>
+        </w:rPr>
+      </w:pPr>
+    </w:p>
+    <w:p>
+      <w:pPr>
+        <w:rPr>
+          <w:rFonts w:ascii="Bell MT" w:hAnsi="Bell MT"/>
+          <w:color w:val="FF0000"/>
+          <w:sz w:val="24"/>
+          <w:szCs w:val="24"/>
+        </w:rPr>
+      </w:pPr>
+      <w:r>
+        <w:rPr>
+          <w:rFonts w:ascii="Bell MT" w:hAnsi="Bell MT"/>
+          <w:sz w:val="24"/>
+          <w:szCs w:val="24"/>
+        </w:rPr>
+        <w:t xml:space="preserve">NB : </w:t>
+      </w:r>
+      <w:r>
+        <w:rPr>
+          <w:rFonts w:ascii="Bell MT" w:hAnsi="Bell MT"/>
+          <w:color w:val="FF0000"/>
+          <w:sz w:val="24"/>
+          <w:szCs w:val="24"/>
+        </w:rPr>
+        <w:t xml:space="preserve">Toutes les équipes chargées des Applications ne doivent pas encore relier à la base de données. Juste faire les Applications rien d’autres. </w:t>
+      </w:r>
+      <w:r>
+        <w:rPr>
+          <w:rFonts w:ascii="Bell MT" w:hAnsi="Bell MT"/>
+          <w:color w:val="FF0000"/>
+          <w:sz w:val="24"/>
+          <w:szCs w:val="24"/>
+        </w:rPr>
+        <w:br/>
+        <w:t xml:space="preserve">Apprenez à utiliser </w:t>
+      </w:r>
+      <w:proofErr w:type="spellStart"/>
+      <w:r>
+        <w:rPr>
+          <w:rFonts w:ascii="Bell MT" w:hAnsi="Bell MT"/>
+          <w:color w:val="FF0000"/>
+          <w:sz w:val="24"/>
+          <w:szCs w:val="24"/>
+        </w:rPr>
+        <w:t>GitHub</w:t>
+      </w:r>
+      <w:proofErr w:type="spellEnd"/>
+      <w:r>
+        <w:rPr>
+          <w:rFonts w:ascii="Bell MT" w:hAnsi="Bell MT"/>
+          <w:color w:val="FF0000"/>
+          <w:sz w:val="24"/>
+          <w:szCs w:val="24"/>
+        </w:rPr>
+        <w:t xml:space="preserve"> dernier délai Mardi 15h. On veut voir tout le monde sur </w:t>
+      </w:r>
+      <w:proofErr w:type="spellStart"/>
+      <w:r>
+        <w:rPr>
+          <w:rFonts w:ascii="Bell MT" w:hAnsi="Bell MT"/>
+          <w:color w:val="FF0000"/>
+          <w:sz w:val="24"/>
+          <w:szCs w:val="24"/>
+        </w:rPr>
+        <w:t>GitHub</w:t>
+      </w:r>
+      <w:proofErr w:type="spellEnd"/>
+      <w:r>
+        <w:rPr>
+          <w:rFonts w:ascii="Bell MT" w:hAnsi="Bell MT"/>
+          <w:color w:val="FF0000"/>
+          <w:sz w:val="24"/>
+          <w:szCs w:val="24"/>
+        </w:rPr>
+        <w:t xml:space="preserve"> ce </w:t>
+      </w:r>
+      <w:proofErr w:type="spellStart"/>
+      <w:r>
+        <w:rPr>
+          <w:rFonts w:ascii="Bell MT" w:hAnsi="Bell MT"/>
+          <w:color w:val="FF0000"/>
+          <w:sz w:val="24"/>
+          <w:szCs w:val="24"/>
+        </w:rPr>
+        <w:t>jour là</w:t>
+      </w:r>
+      <w:proofErr w:type="spellEnd"/>
+      <w:r>
+        <w:rPr>
+          <w:rFonts w:ascii="Bell MT" w:hAnsi="Bell MT"/>
+          <w:color w:val="FF0000"/>
+          <w:sz w:val="24"/>
+          <w:szCs w:val="24"/>
+        </w:rPr>
+        <w:t>.</w:t>
+      </w:r>
+    </w:p>
+    <w:p>
+      <w:pPr>
+        <w:rPr>
+          <w:rFonts w:ascii="Bell MT" w:hAnsi="Bell MT"/>
+          <w:sz w:val="24"/>
+          <w:szCs w:val="24"/>
+        </w:rPr>
+      </w:pPr>
+      <w:r>
+        <w:rPr>
+          <w:rFonts w:ascii="Bell MT" w:hAnsi="Bell MT"/>
+          <w:sz w:val="24"/>
+          <w:szCs w:val="24"/>
+        </w:rPr>
+        <w:t xml:space="preserve">Chaque groupe de travail doit d’abord prendre en compte les demandes du cahier de charge et puis après seulement commencer à les lister puis voir comment les réaliser. Lire -&gt; Noter -&gt; Réaliser pardon. </w:t>
+      </w:r>
+    </w:p>
+    <w:p>
+      <w:pPr>
+        <w:rPr>
+          <w:rFonts w:ascii="Bell MT" w:hAnsi="Bell MT"/>
+          <w:sz w:val="24"/>
+          <w:szCs w:val="24"/>
+        </w:rPr>
+      </w:pPr>
+    </w:p>
+    <w:p>
+      <w:pPr>
+        <w:spacing w:before="100" w:beforeAutospacing="1" w:after="100" w:afterAutospacing="1" w:line="240" w:lineRule="auto"/>
+        <w:outlineLvl w:val="2"/>
+        <w:rPr>
+          <w:rFonts w:ascii="Bell MT" w:eastAsia="Times New Roman" w:hAnsi="Bell MT" w:cs="Times New Roman"/>
+          <w:bCs/>
+          <w:sz w:val="24"/>
+          <w:szCs w:val="24"/>
+          <w:lang w:eastAsia="fr-FR"/>
+        </w:rPr>
+      </w:pPr>
+      <w:r>
+        <w:rPr>
+          <w:rFonts w:ascii="Bell MT" w:eastAsia="Times New Roman" w:hAnsi="Bell MT" w:cs="Times New Roman"/>
+          <w:bCs/>
+          <w:sz w:val="24"/>
+          <w:szCs w:val="24"/>
+          <w:lang w:eastAsia="fr-FR"/>
+        </w:rPr>
+        <w:t>Liste des exigences du cahier de charges pour le Groupe 1 : La Base de Données (BD)</w:t>
+      </w:r>
+    </w:p>
+    <w:p>
+      <w:pPr>
+        <w:numPr>
+          <w:ilvl w:val="0"/>
+          <w:numId w:val="1"/>
+        </w:numPr>
+        <w:spacing w:before="100" w:beforeAutospacing="1" w:after="100" w:afterAutospacing="1" w:line="240" w:lineRule="auto"/>
+        <w:rPr>
+          <w:rFonts w:ascii="Bell MT" w:eastAsia="Times New Roman" w:hAnsi="Bell MT" w:cs="Times New Roman"/>
+          <w:sz w:val="24"/>
+          <w:szCs w:val="24"/>
+          <w:lang w:eastAsia="fr-FR"/>
+        </w:rPr>
+      </w:pPr>
+      <w:r>
+        <w:rPr>
+          <w:rFonts w:ascii="Bell MT" w:eastAsia="Times New Roman" w:hAnsi="Bell MT" w:cs="Times New Roman"/>
+          <w:bCs/>
+          <w:sz w:val="24"/>
+          <w:szCs w:val="24"/>
+          <w:lang w:eastAsia="fr-FR"/>
+        </w:rPr>
+        <w:t>Rédiger le Document de Spécification du Modèle Conceptuel (SCM) :</w:t>
+      </w:r>
+      <w:r>
+        <w:rPr>
+          <w:rFonts w:ascii="Bell MT" w:eastAsia="Times New Roman" w:hAnsi="Bell MT" w:cs="Times New Roman"/>
+          <w:sz w:val="24"/>
+          <w:szCs w:val="24"/>
+          <w:lang w:eastAsia="fr-FR"/>
+        </w:rPr>
+        <w:t xml:space="preserve"> Il doit contenir l'énoncé, l'analyse, le dictionnaire de données complet et la motivation des choix.</w:t>
+      </w:r>
+    </w:p>
+    <w:p>
+      <w:pPr>
+        <w:numPr>
+          <w:ilvl w:val="0"/>
+          <w:numId w:val="1"/>
+        </w:numPr>
+        <w:spacing w:before="100" w:beforeAutospacing="1" w:after="100" w:afterAutospacing="1" w:line="240" w:lineRule="auto"/>
+        <w:rPr>
+          <w:rFonts w:ascii="Bell MT" w:eastAsia="Times New Roman" w:hAnsi="Bell MT" w:cs="Times New Roman"/>
+          <w:sz w:val="24"/>
+          <w:szCs w:val="24"/>
+          <w:lang w:eastAsia="fr-FR"/>
+        </w:rPr>
+      </w:pPr>
+      <w:r>
+        <w:rPr>
+          <w:rFonts w:ascii="Bell MT" w:eastAsia="Times New Roman" w:hAnsi="Bell MT" w:cs="Times New Roman"/>
+          <w:bCs/>
+          <w:sz w:val="24"/>
+          <w:szCs w:val="24"/>
+          <w:lang w:eastAsia="fr-FR"/>
+        </w:rPr>
+        <w:t>Réaliser le Modèle Conceptuel des Données (MCD) :</w:t>
+      </w:r>
+      <w:r>
+        <w:rPr>
+          <w:rFonts w:ascii="Bell MT" w:eastAsia="Times New Roman" w:hAnsi="Bell MT" w:cs="Times New Roman"/>
+          <w:sz w:val="24"/>
+          <w:szCs w:val="24"/>
+          <w:lang w:eastAsia="fr-FR"/>
+        </w:rPr>
+        <w:t xml:space="preserve"> Modéliser graphiquement les entités et relations sous Merise ou EAE.</w:t>
+      </w:r>
       <w:bookmarkStart w:id="0" w:name="_GoBack"/>
       <w:bookmarkEnd w:id="0"/>
     </w:p>
     <w:p>
       <w:pPr>
-        <w:rPr>
-          <w:color w:val="FF0000"/>
-        </w:rPr>
-      </w:pPr>
-      <w:r>
-        <w:t xml:space="preserve">NB : </w:t>
-      </w:r>
-      <w:r>
-        <w:rPr>
-          <w:color w:val="FF0000"/>
-        </w:rPr>
-        <w:t xml:space="preserve">Toutes les équipes chargées des Applications ne doivent pas encore relier à la base de données. Juste faire les Applications rien d’autres. </w:t>
-      </w:r>
-      <w:r>
-        <w:rPr>
-          <w:color w:val="FF0000"/>
-        </w:rPr>
-        <w:br/>
-        <w:t xml:space="preserve">Apprenez à utiliser </w:t>
+        <w:numPr>
+          <w:ilvl w:val="0"/>
+          <w:numId w:val="1"/>
+        </w:numPr>
+        <w:spacing w:before="100" w:beforeAutospacing="1" w:after="100" w:afterAutospacing="1" w:line="240" w:lineRule="auto"/>
+        <w:rPr>
+          <w:rFonts w:ascii="Bell MT" w:eastAsia="Times New Roman" w:hAnsi="Bell MT" w:cs="Times New Roman"/>
+          <w:sz w:val="24"/>
+          <w:szCs w:val="24"/>
+          <w:lang w:eastAsia="fr-FR"/>
+        </w:rPr>
+      </w:pPr>
+      <w:r>
+        <w:rPr>
+          <w:rFonts w:ascii="Bell MT" w:eastAsia="Times New Roman" w:hAnsi="Bell MT" w:cs="Times New Roman"/>
+          <w:bCs/>
+          <w:sz w:val="24"/>
+          <w:szCs w:val="24"/>
+          <w:lang w:eastAsia="fr-FR"/>
+        </w:rPr>
+        <w:t>Fournir le Modèle Logique des Données (MLD) normalisé :</w:t>
+      </w:r>
+      <w:r>
+        <w:rPr>
+          <w:rFonts w:ascii="Bell MT" w:eastAsia="Times New Roman" w:hAnsi="Bell MT" w:cs="Times New Roman"/>
+          <w:sz w:val="24"/>
+          <w:szCs w:val="24"/>
+          <w:lang w:eastAsia="fr-FR"/>
+        </w:rPr>
+        <w:t xml:space="preserve"> Le modèle relationnel doit obligatoirement respecter la </w:t>
+      </w:r>
+      <w:r>
+        <w:rPr>
+          <w:rFonts w:ascii="Bell MT" w:eastAsia="Times New Roman" w:hAnsi="Bell MT" w:cs="Times New Roman"/>
+          <w:bCs/>
+          <w:sz w:val="24"/>
+          <w:szCs w:val="24"/>
+          <w:lang w:eastAsia="fr-FR"/>
+        </w:rPr>
+        <w:t>5ème forme normale (5FN)</w:t>
+      </w:r>
+      <w:r>
+        <w:rPr>
+          <w:rFonts w:ascii="Bell MT" w:eastAsia="Times New Roman" w:hAnsi="Bell MT" w:cs="Times New Roman"/>
+          <w:sz w:val="24"/>
+          <w:szCs w:val="24"/>
+          <w:lang w:eastAsia="fr-FR"/>
+        </w:rPr>
+        <w:t>.</w:t>
+      </w:r>
+    </w:p>
+    <w:p>
+      <w:pPr>
+        <w:numPr>
+          <w:ilvl w:val="0"/>
+          <w:numId w:val="1"/>
+        </w:numPr>
+        <w:spacing w:before="100" w:beforeAutospacing="1" w:after="100" w:afterAutospacing="1" w:line="240" w:lineRule="auto"/>
+        <w:rPr>
+          <w:rFonts w:ascii="Bell MT" w:eastAsia="Times New Roman" w:hAnsi="Bell MT" w:cs="Times New Roman"/>
+          <w:sz w:val="24"/>
+          <w:szCs w:val="24"/>
+          <w:lang w:eastAsia="fr-FR"/>
+        </w:rPr>
+      </w:pPr>
+      <w:r>
+        <w:rPr>
+          <w:rFonts w:ascii="Bell MT" w:eastAsia="Times New Roman" w:hAnsi="Bell MT" w:cs="Times New Roman"/>
+          <w:bCs/>
+          <w:sz w:val="24"/>
+          <w:szCs w:val="24"/>
+          <w:lang w:eastAsia="fr-FR"/>
+        </w:rPr>
+        <w:t>Intégrer les 4 groupes d'entités minimaux :</w:t>
+      </w:r>
+      <w:r>
+        <w:rPr>
+          <w:rFonts w:ascii="Bell MT" w:eastAsia="Times New Roman" w:hAnsi="Bell MT" w:cs="Times New Roman"/>
+          <w:sz w:val="24"/>
+          <w:szCs w:val="24"/>
+          <w:lang w:eastAsia="fr-FR"/>
+        </w:rPr>
+        <w:t xml:space="preserve"> * </w:t>
+      </w:r>
+      <w:r>
+        <w:rPr>
+          <w:rFonts w:ascii="Bell MT" w:eastAsia="Times New Roman" w:hAnsi="Bell MT" w:cs="Times New Roman"/>
+          <w:iCs/>
+          <w:sz w:val="24"/>
+          <w:szCs w:val="24"/>
+          <w:lang w:eastAsia="fr-FR"/>
+        </w:rPr>
+        <w:t>Les Intervenants</w:t>
+      </w:r>
+      <w:r>
+        <w:rPr>
+          <w:rFonts w:ascii="Bell MT" w:eastAsia="Times New Roman" w:hAnsi="Bell MT" w:cs="Times New Roman"/>
+          <w:sz w:val="24"/>
+          <w:szCs w:val="24"/>
+          <w:lang w:eastAsia="fr-FR"/>
+        </w:rPr>
+        <w:t xml:space="preserve"> (Organisations, Individus, Répertoire).</w:t>
+      </w:r>
+    </w:p>
+    <w:p>
+      <w:pPr>
+        <w:numPr>
+          <w:ilvl w:val="1"/>
+          <w:numId w:val="1"/>
+        </w:numPr>
+        <w:spacing w:before="100" w:beforeAutospacing="1" w:after="100" w:afterAutospacing="1" w:line="240" w:lineRule="auto"/>
+        <w:rPr>
+          <w:rFonts w:ascii="Bell MT" w:eastAsia="Times New Roman" w:hAnsi="Bell MT" w:cs="Times New Roman"/>
+          <w:sz w:val="24"/>
+          <w:szCs w:val="24"/>
+          <w:lang w:eastAsia="fr-FR"/>
+        </w:rPr>
+      </w:pPr>
+      <w:r>
+        <w:rPr>
+          <w:rFonts w:ascii="Bell MT" w:eastAsia="Times New Roman" w:hAnsi="Bell MT" w:cs="Times New Roman"/>
+          <w:iCs/>
+          <w:sz w:val="24"/>
+          <w:szCs w:val="24"/>
+          <w:lang w:eastAsia="fr-FR"/>
+        </w:rPr>
+        <w:t>Les Produits</w:t>
+      </w:r>
+      <w:r>
+        <w:rPr>
+          <w:rFonts w:ascii="Bell MT" w:eastAsia="Times New Roman" w:hAnsi="Bell MT" w:cs="Times New Roman"/>
+          <w:sz w:val="24"/>
+          <w:szCs w:val="24"/>
+          <w:lang w:eastAsia="fr-FR"/>
+        </w:rPr>
+        <w:t xml:space="preserve"> (Matériels, Lots, Inventaires, Emballages).</w:t>
+      </w:r>
+    </w:p>
+    <w:p>
+      <w:pPr>
+        <w:numPr>
+          <w:ilvl w:val="1"/>
+          <w:numId w:val="1"/>
+        </w:numPr>
+        <w:spacing w:before="100" w:beforeAutospacing="1" w:after="100" w:afterAutospacing="1" w:line="240" w:lineRule="auto"/>
+        <w:rPr>
+          <w:rFonts w:ascii="Bell MT" w:eastAsia="Times New Roman" w:hAnsi="Bell MT" w:cs="Times New Roman"/>
+          <w:sz w:val="24"/>
+          <w:szCs w:val="24"/>
+          <w:lang w:eastAsia="fr-FR"/>
+        </w:rPr>
+      </w:pPr>
+      <w:r>
+        <w:rPr>
+          <w:rFonts w:ascii="Bell MT" w:eastAsia="Times New Roman" w:hAnsi="Bell MT" w:cs="Times New Roman"/>
+          <w:iCs/>
+          <w:sz w:val="24"/>
+          <w:szCs w:val="24"/>
+          <w:lang w:eastAsia="fr-FR"/>
+        </w:rPr>
+        <w:t>L'Entrepôt</w:t>
+      </w:r>
+      <w:r>
+        <w:rPr>
+          <w:rFonts w:ascii="Bell MT" w:eastAsia="Times New Roman" w:hAnsi="Bell MT" w:cs="Times New Roman"/>
+          <w:sz w:val="24"/>
+          <w:szCs w:val="24"/>
+          <w:lang w:eastAsia="fr-FR"/>
+        </w:rPr>
+        <w:t xml:space="preserve"> (Cellules de stockage avec leurs dimensions/masses maximales, inventaire d'emplacements, colis entrants/sortants).</w:t>
+      </w:r>
+    </w:p>
+    <w:p>
+      <w:pPr>
+        <w:numPr>
+          <w:ilvl w:val="1"/>
+          <w:numId w:val="1"/>
+        </w:numPr>
+        <w:spacing w:before="100" w:beforeAutospacing="1" w:after="100" w:afterAutospacing="1" w:line="240" w:lineRule="auto"/>
+        <w:rPr>
+          <w:rFonts w:ascii="Bell MT" w:eastAsia="Times New Roman" w:hAnsi="Bell MT" w:cs="Times New Roman"/>
+          <w:sz w:val="24"/>
+          <w:szCs w:val="24"/>
+          <w:lang w:eastAsia="fr-FR"/>
+        </w:rPr>
+      </w:pPr>
+      <w:r>
+        <w:rPr>
+          <w:rFonts w:ascii="Bell MT" w:eastAsia="Times New Roman" w:hAnsi="Bell MT" w:cs="Times New Roman"/>
+          <w:iCs/>
+          <w:sz w:val="24"/>
+          <w:szCs w:val="24"/>
+          <w:lang w:eastAsia="fr-FR"/>
+        </w:rPr>
+        <w:t>Les Artéfacts</w:t>
+      </w:r>
+      <w:r>
+        <w:rPr>
+          <w:rFonts w:ascii="Bell MT" w:eastAsia="Times New Roman" w:hAnsi="Bell MT" w:cs="Times New Roman"/>
+          <w:sz w:val="24"/>
+          <w:szCs w:val="24"/>
+          <w:lang w:eastAsia="fr-FR"/>
+        </w:rPr>
+        <w:t xml:space="preserve"> (Bons de réception, bons d'expédition, rapports d'exception).</w:t>
+      </w:r>
+    </w:p>
+    <w:p>
+      <w:pPr>
+        <w:numPr>
+          <w:ilvl w:val="0"/>
+          <w:numId w:val="1"/>
+        </w:numPr>
+        <w:spacing w:before="100" w:beforeAutospacing="1" w:after="100" w:afterAutospacing="1" w:line="240" w:lineRule="auto"/>
+        <w:rPr>
+          <w:rFonts w:ascii="Bell MT" w:eastAsia="Times New Roman" w:hAnsi="Bell MT" w:cs="Times New Roman"/>
+          <w:sz w:val="24"/>
+          <w:szCs w:val="24"/>
+          <w:lang w:eastAsia="fr-FR"/>
+        </w:rPr>
+      </w:pPr>
+      <w:r>
+        <w:rPr>
+          <w:rFonts w:ascii="Bell MT" w:eastAsia="Times New Roman" w:hAnsi="Bell MT" w:cs="Times New Roman"/>
+          <w:bCs/>
+          <w:sz w:val="24"/>
+          <w:szCs w:val="24"/>
+          <w:lang w:eastAsia="fr-FR"/>
+        </w:rPr>
+        <w:t xml:space="preserve">Créer le script </w:t>
       </w:r>
       <w:proofErr w:type="spellStart"/>
       <w:r>
         <w:rPr>
-          <w:color w:val="FF0000"/>
-        </w:rPr>
-        <w:t>GitHub</w:t>
+          <w:rFonts w:ascii="Bell MT" w:eastAsia="Times New Roman" w:hAnsi="Bell MT" w:cs="Courier New"/>
+          <w:bCs/>
+          <w:sz w:val="24"/>
+          <w:szCs w:val="24"/>
+          <w:lang w:eastAsia="fr-FR"/>
+        </w:rPr>
+        <w:t>SGE_cre.sql</w:t>
       </w:r>
       <w:proofErr w:type="spellEnd"/>
       <w:r>
         <w:rPr>
-          <w:color w:val="FF0000"/>
-        </w:rPr>
-        <w:t xml:space="preserve"> dernier délai Mardi 15h. On veut voir tout le monde sur </w:t>
+          <w:rFonts w:ascii="Bell MT" w:eastAsia="Times New Roman" w:hAnsi="Bell MT" w:cs="Times New Roman"/>
+          <w:bCs/>
+          <w:sz w:val="24"/>
+          <w:szCs w:val="24"/>
+          <w:lang w:eastAsia="fr-FR"/>
+        </w:rPr>
+        <w:t xml:space="preserve"> :</w:t>
+      </w:r>
+      <w:r>
+        <w:rPr>
+          <w:rFonts w:ascii="Bell MT" w:eastAsia="Times New Roman" w:hAnsi="Bell MT" w:cs="Times New Roman"/>
+          <w:sz w:val="24"/>
+          <w:szCs w:val="24"/>
+          <w:lang w:eastAsia="fr-FR"/>
+        </w:rPr>
+        <w:t xml:space="preserve"> Script propre de création des domaines, types, tables, clés primaires et clés étrangères sous </w:t>
       </w:r>
       <w:proofErr w:type="spellStart"/>
       <w:r>
         <w:rPr>
-          <w:color w:val="FF0000"/>
-        </w:rPr>
-        <w:t>GitHub</w:t>
+          <w:rFonts w:ascii="Bell MT" w:eastAsia="Times New Roman" w:hAnsi="Bell MT" w:cs="Times New Roman"/>
+          <w:bCs/>
+          <w:sz w:val="24"/>
+          <w:szCs w:val="24"/>
+          <w:lang w:eastAsia="fr-FR"/>
+        </w:rPr>
+        <w:t>PostgreSQL</w:t>
       </w:r>
       <w:proofErr w:type="spellEnd"/>
       <w:r>
         <w:rPr>
-          <w:color w:val="FF0000"/>
-        </w:rPr>
-        <w:t xml:space="preserve"> ce </w:t>
+          <w:rFonts w:ascii="Bell MT" w:eastAsia="Times New Roman" w:hAnsi="Bell MT" w:cs="Times New Roman"/>
+          <w:sz w:val="24"/>
+          <w:szCs w:val="24"/>
+          <w:lang w:eastAsia="fr-FR"/>
+        </w:rPr>
+        <w:t>.</w:t>
+      </w:r>
+    </w:p>
+    <w:p>
+      <w:pPr>
+        <w:numPr>
+          <w:ilvl w:val="0"/>
+          <w:numId w:val="1"/>
+        </w:numPr>
+        <w:spacing w:before="100" w:beforeAutospacing="1" w:after="100" w:afterAutospacing="1" w:line="240" w:lineRule="auto"/>
+        <w:rPr>
+          <w:rFonts w:ascii="Bell MT" w:eastAsia="Times New Roman" w:hAnsi="Bell MT" w:cs="Times New Roman"/>
+          <w:sz w:val="24"/>
+          <w:szCs w:val="24"/>
+          <w:lang w:eastAsia="fr-FR"/>
+        </w:rPr>
+      </w:pPr>
+      <w:r>
+        <w:rPr>
+          <w:rFonts w:ascii="Bell MT" w:eastAsia="Times New Roman" w:hAnsi="Bell MT" w:cs="Times New Roman"/>
+          <w:bCs/>
+          <w:sz w:val="24"/>
+          <w:szCs w:val="24"/>
+          <w:lang w:eastAsia="fr-FR"/>
+        </w:rPr>
+        <w:t xml:space="preserve">Créer le script </w:t>
       </w:r>
       <w:proofErr w:type="spellStart"/>
       <w:r>
         <w:rPr>
-          <w:color w:val="FF0000"/>
-        </w:rPr>
-        <w:t>jour là</w:t>
+          <w:rFonts w:ascii="Bell MT" w:eastAsia="Times New Roman" w:hAnsi="Bell MT" w:cs="Courier New"/>
+          <w:bCs/>
+          <w:sz w:val="24"/>
+          <w:szCs w:val="24"/>
+          <w:lang w:eastAsia="fr-FR"/>
+        </w:rPr>
+        <w:t>SGE_inv.sql</w:t>
       </w:r>
       <w:proofErr w:type="spellEnd"/>
       <w:r>
         <w:rPr>
-          <w:color w:val="FF0000"/>
-        </w:rPr>
-        <w:t>.</w:t>
-      </w:r>
-    </w:p>
-    <w:p>
-      <w:r>
-        <w:t>Chaque groupe de travail doit d’abord prendre en compte les demandes du cahier de charge et puis après seulement commencer à les lister puis voir comment les réaliser. Lire -</w:t>
-      </w:r>
-      <w:r>
-        <w:t>&gt;</w:t>
-      </w:r>
-      <w:r>
-        <w:t xml:space="preserve"> Noter -</w:t>
-      </w:r>
-      <w:r>
-        <w:t>&gt;</w:t>
-      </w:r>
-      <w:r>
-        <w:t xml:space="preserve"> Réaliser pardon. </w:t>
-      </w:r>
+          <w:rFonts w:ascii="Bell MT" w:eastAsia="Times New Roman" w:hAnsi="Bell MT" w:cs="Times New Roman"/>
+          <w:bCs/>
+          <w:sz w:val="24"/>
+          <w:szCs w:val="24"/>
+          <w:lang w:eastAsia="fr-FR"/>
+        </w:rPr>
+        <w:t xml:space="preserve"> (Les Invariants) :</w:t>
+      </w:r>
+      <w:r>
+        <w:rPr>
+          <w:rFonts w:ascii="Bell MT" w:eastAsia="Times New Roman" w:hAnsi="Bell MT" w:cs="Times New Roman"/>
+          <w:sz w:val="24"/>
+          <w:szCs w:val="24"/>
+          <w:lang w:eastAsia="fr-FR"/>
+        </w:rPr>
+        <w:t xml:space="preserve"> Écrire les fonctions, routines et </w:t>
+      </w:r>
+      <w:r>
+        <w:rPr>
+          <w:rFonts w:ascii="Bell MT" w:eastAsia="Times New Roman" w:hAnsi="Bell MT" w:cs="Times New Roman"/>
+          <w:bCs/>
+          <w:sz w:val="24"/>
+          <w:szCs w:val="24"/>
+          <w:lang w:eastAsia="fr-FR"/>
+        </w:rPr>
+        <w:t>déclencheurs (triggers)</w:t>
+      </w:r>
+      <w:r>
+        <w:rPr>
+          <w:rFonts w:ascii="Bell MT" w:eastAsia="Times New Roman" w:hAnsi="Bell MT" w:cs="Times New Roman"/>
+          <w:sz w:val="24"/>
+          <w:szCs w:val="24"/>
+          <w:lang w:eastAsia="fr-FR"/>
+        </w:rPr>
+        <w:t xml:space="preserve"> pour automatiser la vérification des règles logistiques et interdire les anomalies (ex: colis trop lourd pour une cellule).</w:t>
+      </w:r>
+    </w:p>
+    <w:p>
+      <w:pPr>
+        <w:numPr>
+          <w:ilvl w:val="0"/>
+          <w:numId w:val="1"/>
+        </w:numPr>
+        <w:spacing w:before="100" w:beforeAutospacing="1" w:after="100" w:afterAutospacing="1" w:line="240" w:lineRule="auto"/>
+        <w:rPr>
+          <w:rFonts w:ascii="Bell MT" w:eastAsia="Times New Roman" w:hAnsi="Bell MT" w:cs="Times New Roman"/>
+          <w:sz w:val="24"/>
+          <w:szCs w:val="24"/>
+          <w:lang w:eastAsia="fr-FR"/>
+        </w:rPr>
+      </w:pPr>
+      <w:r>
+        <w:rPr>
+          <w:rFonts w:ascii="Bell MT" w:eastAsia="Times New Roman" w:hAnsi="Bell MT" w:cs="Times New Roman"/>
+          <w:bCs/>
+          <w:sz w:val="24"/>
+          <w:szCs w:val="24"/>
+          <w:lang w:eastAsia="fr-FR"/>
+        </w:rPr>
+        <w:t>Développer l'Interface Machine-Machine (IMM) :</w:t>
+      </w:r>
+      <w:r>
+        <w:rPr>
+          <w:rFonts w:ascii="Bell MT" w:eastAsia="Times New Roman" w:hAnsi="Bell MT" w:cs="Times New Roman"/>
+          <w:sz w:val="24"/>
+          <w:szCs w:val="24"/>
+          <w:lang w:eastAsia="fr-FR"/>
+        </w:rPr>
+        <w:t xml:space="preserve"> Fournir les trois scripts d'interface :</w:t>
+      </w:r>
+    </w:p>
+    <w:p>
+      <w:pPr>
+        <w:numPr>
+          <w:ilvl w:val="1"/>
+          <w:numId w:val="1"/>
+        </w:numPr>
+        <w:spacing w:before="100" w:beforeAutospacing="1" w:after="100" w:afterAutospacing="1" w:line="240" w:lineRule="auto"/>
+        <w:rPr>
+          <w:rFonts w:ascii="Bell MT" w:eastAsia="Times New Roman" w:hAnsi="Bell MT" w:cs="Times New Roman"/>
+          <w:sz w:val="24"/>
+          <w:szCs w:val="24"/>
+          <w:lang w:eastAsia="fr-FR"/>
+        </w:rPr>
+      </w:pPr>
+      <w:proofErr w:type="spellStart"/>
+      <w:r>
+        <w:rPr>
+          <w:rFonts w:ascii="Bell MT" w:eastAsia="Times New Roman" w:hAnsi="Bell MT" w:cs="Courier New"/>
+          <w:sz w:val="24"/>
+          <w:szCs w:val="24"/>
+          <w:lang w:eastAsia="fr-FR"/>
+        </w:rPr>
+        <w:t>SGE_imm.sql</w:t>
+      </w:r>
+      <w:proofErr w:type="spellEnd"/>
+      <w:r>
+        <w:rPr>
+          <w:rFonts w:ascii="Bell MT" w:eastAsia="Times New Roman" w:hAnsi="Bell MT" w:cs="Times New Roman"/>
+          <w:sz w:val="24"/>
+          <w:szCs w:val="24"/>
+          <w:lang w:eastAsia="fr-FR"/>
+        </w:rPr>
+        <w:t xml:space="preserve"> (Procédures d'insertions, retraits et modifications).</w:t>
+      </w:r>
+    </w:p>
+    <w:p>
+      <w:pPr>
+        <w:numPr>
+          <w:ilvl w:val="1"/>
+          <w:numId w:val="1"/>
+        </w:numPr>
+        <w:spacing w:before="100" w:beforeAutospacing="1" w:after="100" w:afterAutospacing="1" w:line="240" w:lineRule="auto"/>
+        <w:rPr>
+          <w:rFonts w:ascii="Bell MT" w:eastAsia="Times New Roman" w:hAnsi="Bell MT" w:cs="Times New Roman"/>
+          <w:sz w:val="24"/>
+          <w:szCs w:val="24"/>
+          <w:lang w:eastAsia="fr-FR"/>
+        </w:rPr>
+      </w:pPr>
+      <w:proofErr w:type="spellStart"/>
+      <w:r>
+        <w:rPr>
+          <w:rFonts w:ascii="Bell MT" w:eastAsia="Times New Roman" w:hAnsi="Bell MT" w:cs="Courier New"/>
+          <w:sz w:val="24"/>
+          <w:szCs w:val="24"/>
+          <w:lang w:eastAsia="fr-FR"/>
+        </w:rPr>
+        <w:t>SGE_req.sql</w:t>
+      </w:r>
+      <w:proofErr w:type="spellEnd"/>
+      <w:r>
+        <w:rPr>
+          <w:rFonts w:ascii="Bell MT" w:eastAsia="Times New Roman" w:hAnsi="Bell MT" w:cs="Times New Roman"/>
+          <w:sz w:val="24"/>
+          <w:szCs w:val="24"/>
+          <w:lang w:eastAsia="fr-FR"/>
+        </w:rPr>
+        <w:t xml:space="preserve"> (Requêtes de sélection et de consultation pour les applications).</w:t>
+      </w:r>
+    </w:p>
+    <w:p>
+      <w:pPr>
+        <w:numPr>
+          <w:ilvl w:val="1"/>
+          <w:numId w:val="1"/>
+        </w:numPr>
+        <w:spacing w:before="100" w:beforeAutospacing="1" w:after="100" w:afterAutospacing="1" w:line="240" w:lineRule="auto"/>
+        <w:rPr>
+          <w:rFonts w:ascii="Bell MT" w:eastAsia="Times New Roman" w:hAnsi="Bell MT" w:cs="Times New Roman"/>
+          <w:sz w:val="24"/>
+          <w:szCs w:val="24"/>
+          <w:lang w:eastAsia="fr-FR"/>
+        </w:rPr>
+      </w:pPr>
+      <w:proofErr w:type="spellStart"/>
+      <w:r>
+        <w:rPr>
+          <w:rFonts w:ascii="Bell MT" w:eastAsia="Times New Roman" w:hAnsi="Bell MT" w:cs="Courier New"/>
+          <w:sz w:val="24"/>
+          <w:szCs w:val="24"/>
+          <w:lang w:eastAsia="fr-FR"/>
+        </w:rPr>
+        <w:t>SGE_tra.sql</w:t>
+      </w:r>
+      <w:proofErr w:type="spellEnd"/>
+      <w:r>
+        <w:rPr>
+          <w:rFonts w:ascii="Bell MT" w:eastAsia="Times New Roman" w:hAnsi="Bell MT" w:cs="Times New Roman"/>
+          <w:sz w:val="24"/>
+          <w:szCs w:val="24"/>
+          <w:lang w:eastAsia="fr-FR"/>
+        </w:rPr>
+        <w:t xml:space="preserve"> (Procédures de traitement et mises à jour globales).</w:t>
+      </w:r>
+    </w:p>
+    <w:p>
+      <w:pPr>
+        <w:numPr>
+          <w:ilvl w:val="0"/>
+          <w:numId w:val="1"/>
+        </w:numPr>
+        <w:spacing w:before="100" w:beforeAutospacing="1" w:after="100" w:afterAutospacing="1" w:line="240" w:lineRule="auto"/>
+        <w:rPr>
+          <w:rFonts w:ascii="Bell MT" w:eastAsia="Times New Roman" w:hAnsi="Bell MT" w:cs="Times New Roman"/>
+          <w:sz w:val="24"/>
+          <w:szCs w:val="24"/>
+          <w:lang w:eastAsia="fr-FR"/>
+        </w:rPr>
+      </w:pPr>
+      <w:r>
+        <w:rPr>
+          <w:rFonts w:ascii="Bell MT" w:eastAsia="Times New Roman" w:hAnsi="Bell MT" w:cs="Times New Roman"/>
+          <w:bCs/>
+          <w:sz w:val="24"/>
+          <w:szCs w:val="24"/>
+          <w:lang w:eastAsia="fr-FR"/>
+        </w:rPr>
+        <w:t>Créer les scripts de Tests Unitaires :</w:t>
+      </w:r>
+      <w:r>
+        <w:rPr>
+          <w:rFonts w:ascii="Bell MT" w:eastAsia="Times New Roman" w:hAnsi="Bell MT" w:cs="Times New Roman"/>
+          <w:sz w:val="24"/>
+          <w:szCs w:val="24"/>
+          <w:lang w:eastAsia="fr-FR"/>
+        </w:rPr>
+        <w:t xml:space="preserve"> Fournir deux fichiers de tests distincts :</w:t>
+      </w:r>
+    </w:p>
+    <w:p>
+      <w:pPr>
+        <w:numPr>
+          <w:ilvl w:val="1"/>
+          <w:numId w:val="1"/>
+        </w:numPr>
+        <w:spacing w:before="100" w:beforeAutospacing="1" w:after="100" w:afterAutospacing="1" w:line="240" w:lineRule="auto"/>
+        <w:rPr>
+          <w:rFonts w:ascii="Bell MT" w:eastAsia="Times New Roman" w:hAnsi="Bell MT" w:cs="Times New Roman"/>
+          <w:sz w:val="24"/>
+          <w:szCs w:val="24"/>
+          <w:lang w:eastAsia="fr-FR"/>
+        </w:rPr>
+      </w:pPr>
+      <w:proofErr w:type="spellStart"/>
+      <w:r>
+        <w:rPr>
+          <w:rFonts w:ascii="Bell MT" w:eastAsia="Times New Roman" w:hAnsi="Bell MT" w:cs="Courier New"/>
+          <w:sz w:val="24"/>
+          <w:szCs w:val="24"/>
+          <w:lang w:eastAsia="fr-FR"/>
+        </w:rPr>
+        <w:t>SGE_test-pos.sql</w:t>
+      </w:r>
+      <w:proofErr w:type="spellEnd"/>
+      <w:r>
+        <w:rPr>
+          <w:rFonts w:ascii="Bell MT" w:eastAsia="Times New Roman" w:hAnsi="Bell MT" w:cs="Times New Roman"/>
+          <w:sz w:val="24"/>
+          <w:szCs w:val="24"/>
+          <w:lang w:eastAsia="fr-FR"/>
+        </w:rPr>
+        <w:t xml:space="preserve"> (Scénarios de données valides qui doivent être acceptées).</w:t>
+      </w:r>
+    </w:p>
+    <w:p>
+      <w:pPr>
+        <w:numPr>
+          <w:ilvl w:val="1"/>
+          <w:numId w:val="1"/>
+        </w:numPr>
+        <w:spacing w:before="100" w:beforeAutospacing="1" w:after="100" w:afterAutospacing="1" w:line="240" w:lineRule="auto"/>
+        <w:rPr>
+          <w:rFonts w:ascii="Bell MT" w:eastAsia="Times New Roman" w:hAnsi="Bell MT" w:cs="Times New Roman"/>
+          <w:sz w:val="24"/>
+          <w:szCs w:val="24"/>
+          <w:lang w:eastAsia="fr-FR"/>
+        </w:rPr>
+      </w:pPr>
+      <w:proofErr w:type="spellStart"/>
+      <w:r>
+        <w:rPr>
+          <w:rFonts w:ascii="Bell MT" w:eastAsia="Times New Roman" w:hAnsi="Bell MT" w:cs="Courier New"/>
+          <w:sz w:val="24"/>
+          <w:szCs w:val="24"/>
+          <w:lang w:eastAsia="fr-FR"/>
+        </w:rPr>
+        <w:t>SGE_test-neg.sql</w:t>
+      </w:r>
+      <w:proofErr w:type="spellEnd"/>
+      <w:r>
+        <w:rPr>
+          <w:rFonts w:ascii="Bell MT" w:eastAsia="Times New Roman" w:hAnsi="Bell MT" w:cs="Times New Roman"/>
+          <w:sz w:val="24"/>
+          <w:szCs w:val="24"/>
+          <w:lang w:eastAsia="fr-FR"/>
+        </w:rPr>
+        <w:t xml:space="preserve"> (Scénarios de données invalides qui doivent être bloquées par les contraintes/triggers de la BD).</w:t>
+      </w:r>
+    </w:p>
+    <w:p>
+      <w:pPr>
+        <w:rPr>
+          <w:rFonts w:ascii="Bell MT" w:hAnsi="Bell MT"/>
+          <w:sz w:val="24"/>
+          <w:szCs w:val="24"/>
+        </w:rPr>
+      </w:pPr>
     </w:p>
     <w:sectPr>
       <w:pgSz w:w="11906" w:h="16838"/>
@@ -286,6 +1030,131 @@
     </w:sectPr>
   </w:body>
 </w:document>
+</file>
+
+<file path=word/numbering.xml><?xml version="1.0" encoding="utf-8"?>
+<w:numbering xmlns:wpc="http://schemas.microsoft.com/office/word/2010/wordprocessingCanvas" xmlns:mc="http://schemas.openxmlformats.org/markup-compatibility/2006" xmlns:o="urn:schemas-microsoft-com:office:office" xmlns:r="http://schemas.openxmlformats.org/officeDocument/2006/relationships" xmlns:m="http://schemas.openxmlformats.org/officeDocument/2006/math" xmlns:v="urn:schemas-microsoft-com:vml" xmlns:wp14="http://schemas.microsoft.com/office/word/2010/wordprocessingDrawing" xmlns:wp="http://schemas.openxmlformats.org/drawingml/2006/wordprocessingDrawing" xmlns:w10="urn:schemas-microsoft-com:office:word" xmlns:w="http://schemas.openxmlformats.org/wordprocessingml/2006/main" xmlns:w14="http://schemas.microsoft.com/office/word/2010/wordml" xmlns:w15="http://schemas.microsoft.com/office/word/2012/wordml" xmlns:wpg="http://schemas.microsoft.com/office/word/2010/wordprocessingGroup" xmlns:wpi="http://schemas.microsoft.com/office/word/2010/wordprocessingInk" xmlns:wne="http://schemas.microsoft.com/office/word/2006/wordml" xmlns:wps="http://schemas.microsoft.com/office/word/2010/wordprocessingShape" mc:Ignorable="w14 w15 wp14">
+  <w:abstractNum w:abstractNumId="0">
+    <w:nsid w:val="4F6E651E"/>
+    <w:multiLevelType w:val="multilevel"/>
+    <w:tmpl w:val="DF869C6A"/>
+    <w:lvl w:ilvl="0">
+      <w:start w:val="1"/>
+      <w:numFmt w:val="decimal"/>
+      <w:lvlText w:val="%1."/>
+      <w:lvlJc w:val="left"/>
+      <w:pPr>
+        <w:tabs>
+          <w:tab w:val="num" w:pos="720"/>
+        </w:tabs>
+        <w:ind w:left="720" w:hanging="360"/>
+      </w:pPr>
+    </w:lvl>
+    <w:lvl w:ilvl="1">
+      <w:start w:val="1"/>
+      <w:numFmt w:val="bullet"/>
+      <w:lvlText w:val="o"/>
+      <w:lvlJc w:val="left"/>
+      <w:pPr>
+        <w:tabs>
+          <w:tab w:val="num" w:pos="1440"/>
+        </w:tabs>
+        <w:ind w:left="1440" w:hanging="360"/>
+      </w:pPr>
+      <w:rPr>
+        <w:rFonts w:ascii="Courier New" w:hAnsi="Courier New" w:hint="default"/>
+        <w:sz w:val="20"/>
+      </w:rPr>
+    </w:lvl>
+    <w:lvl w:ilvl="2" w:tentative="1">
+      <w:start w:val="1"/>
+      <w:numFmt w:val="decimal"/>
+      <w:lvlText w:val="%3."/>
+      <w:lvlJc w:val="left"/>
+      <w:pPr>
+        <w:tabs>
+          <w:tab w:val="num" w:pos="2160"/>
+        </w:tabs>
+        <w:ind w:left="2160" w:hanging="360"/>
+      </w:pPr>
+    </w:lvl>
+    <w:lvl w:ilvl="3" w:tentative="1">
+      <w:start w:val="1"/>
+      <w:numFmt w:val="decimal"/>
+      <w:lvlText w:val="%4."/>
+      <w:lvlJc w:val="left"/>
+      <w:pPr>
+        <w:tabs>
+          <w:tab w:val="num" w:pos="2880"/>
+        </w:tabs>
+        <w:ind w:left="2880" w:hanging="360"/>
+      </w:pPr>
+    </w:lvl>
+    <w:lvl w:ilvl="4" w:tentative="1">
+      <w:start w:val="1"/>
+      <w:numFmt w:val="decimal"/>
+      <w:lvlText w:val="%5."/>
+      <w:lvlJc w:val="left"/>
+      <w:pPr>
+        <w:tabs>
+          <w:tab w:val="num" w:pos="3600"/>
+        </w:tabs>
+        <w:ind w:left="3600" w:hanging="360"/>
+      </w:pPr>
+    </w:lvl>
+    <w:lvl w:ilvl="5" w:tentative="1">
+      <w:start w:val="1"/>
+      <w:numFmt w:val="decimal"/>
+      <w:lvlText w:val="%6."/>
+      <w:lvlJc w:val="left"/>
+      <w:pPr>
+        <w:tabs>
+          <w:tab w:val="num" w:pos="4320"/>
+        </w:tabs>
+        <w:ind w:left="4320" w:hanging="360"/>
+      </w:pPr>
+    </w:lvl>
+    <w:lvl w:ilvl="6" w:tentative="1">
+      <w:start w:val="1"/>
+      <w:numFmt w:val="decimal"/>
+      <w:lvlText w:val="%7."/>
+      <w:lvlJc w:val="left"/>
+      <w:pPr>
+        <w:tabs>
+          <w:tab w:val="num" w:pos="5040"/>
+        </w:tabs>
+        <w:ind w:left="5040" w:hanging="360"/>
+      </w:pPr>
+    </w:lvl>
+    <w:lvl w:ilvl="7" w:tentative="1">
+      <w:start w:val="1"/>
+      <w:numFmt w:val="decimal"/>
+      <w:lvlText w:val="%8."/>
+      <w:lvlJc w:val="left"/>
+      <w:pPr>
+        <w:tabs>
+          <w:tab w:val="num" w:pos="5760"/>
+        </w:tabs>
+        <w:ind w:left="5760" w:hanging="360"/>
+      </w:pPr>
+    </w:lvl>
+    <w:lvl w:ilvl="8" w:tentative="1">
+      <w:start w:val="1"/>
+      <w:numFmt w:val="decimal"/>
+      <w:lvlText w:val="%9."/>
+      <w:lvlJc w:val="left"/>
+      <w:pPr>
+        <w:tabs>
+          <w:tab w:val="num" w:pos="6480"/>
+        </w:tabs>
+        <w:ind w:left="6480" w:hanging="360"/>
+      </w:pPr>
+    </w:lvl>
+  </w:abstractNum>
+  <w:num w:numId="1">
+    <w:abstractNumId w:val="0"/>
+  </w:num>
+</w:numbering>
 </file>
 
 <file path=word/styles.xml><?xml version="1.0" encoding="utf-8"?>
@@ -682,6 +1551,26 @@
     <w:name w:val="Normal"/>
     <w:qFormat/>
   </w:style>
+  <w:style w:type="paragraph" w:styleId="Titre3">
+    <w:name w:val="heading 3"/>
+    <w:basedOn w:val="Normal"/>
+    <w:link w:val="Titre3Car"/>
+    <w:uiPriority w:val="9"/>
+    <w:qFormat/>
+    <w:rsid w:val="008C6191"/>
+    <w:pPr>
+      <w:spacing w:before="100" w:beforeAutospacing="1" w:after="100" w:afterAutospacing="1" w:line="240" w:lineRule="auto"/>
+      <w:outlineLvl w:val="2"/>
+    </w:pPr>
+    <w:rPr>
+      <w:rFonts w:ascii="Times New Roman" w:eastAsia="Times New Roman" w:hAnsi="Times New Roman" w:cs="Times New Roman"/>
+      <w:b/>
+      <w:bCs/>
+      <w:sz w:val="27"/>
+      <w:szCs w:val="27"/>
+      <w:lang w:eastAsia="fr-FR"/>
+    </w:rPr>
+  </w:style>
   <w:style w:type="character" w:default="1" w:styleId="Policepardfaut">
     <w:name w:val="Default Paragraph Font"/>
     <w:uiPriority w:val="1"/>
@@ -708,6 +1597,51 @@
     <w:uiPriority w:val="99"/>
     <w:semiHidden/>
     <w:unhideWhenUsed/>
+  </w:style>
+  <w:style w:type="character" w:customStyle="1" w:styleId="Titre3Car">
+    <w:name w:val="Titre 3 Car"/>
+    <w:basedOn w:val="Policepardfaut"/>
+    <w:link w:val="Titre3"/>
+    <w:uiPriority w:val="9"/>
+    <w:rsid w:val="008C6191"/>
+    <w:rPr>
+      <w:rFonts w:ascii="Times New Roman" w:eastAsia="Times New Roman" w:hAnsi="Times New Roman" w:cs="Times New Roman"/>
+      <w:b/>
+      <w:bCs/>
+      <w:sz w:val="27"/>
+      <w:szCs w:val="27"/>
+      <w:lang w:eastAsia="fr-FR"/>
+    </w:rPr>
+  </w:style>
+  <w:style w:type="paragraph" w:styleId="NormalWeb">
+    <w:name w:val="Normal (Web)"/>
+    <w:basedOn w:val="Normal"/>
+    <w:uiPriority w:val="99"/>
+    <w:semiHidden/>
+    <w:unhideWhenUsed/>
+    <w:rsid w:val="008C6191"/>
+    <w:pPr>
+      <w:spacing w:before="100" w:beforeAutospacing="1" w:after="100" w:afterAutospacing="1" w:line="240" w:lineRule="auto"/>
+    </w:pPr>
+    <w:rPr>
+      <w:rFonts w:ascii="Times New Roman" w:eastAsia="Times New Roman" w:hAnsi="Times New Roman" w:cs="Times New Roman"/>
+      <w:sz w:val="24"/>
+      <w:szCs w:val="24"/>
+      <w:lang w:eastAsia="fr-FR"/>
+    </w:rPr>
+  </w:style>
+  <w:style w:type="character" w:styleId="CodeHTML">
+    <w:name w:val="HTML Code"/>
+    <w:basedOn w:val="Policepardfaut"/>
+    <w:uiPriority w:val="99"/>
+    <w:semiHidden/>
+    <w:unhideWhenUsed/>
+    <w:rsid w:val="008C6191"/>
+    <w:rPr>
+      <w:rFonts w:ascii="Courier New" w:eastAsia="Times New Roman" w:hAnsi="Courier New" w:cs="Courier New"/>
+      <w:sz w:val="20"/>
+      <w:szCs w:val="20"/>
+    </w:rPr>
   </w:style>
 </w:styles>
 </file>

</xml_diff>